<commit_message>
Correct author name and affiliation
Co-Authored-By: Tatsuki Onishi <bougtoir@gmail.com>
</commit_message>
<xml_diff>
--- a/denisovan-archaic-dna-analysis/docs/ajba_submission/cover_letter_ajba.docx
+++ b/denisovan-archaic-dna-analysis/docs/ajba_submission/cover_letter_ajba.docx
@@ -63,12 +63,12 @@
     </w:p>
     <w:p>
       <w:r>
-        <w:t>Tatsuki Onishi</w:t>
+        <w:t>Onishi Tatsuki</w:t>
       </w:r>
     </w:p>
     <w:p>
       <w:r>
-        <w:t>Data Science and AI Innovation Research Promotion Center, Shiga University of Medical Science, Otsu, Japan</w:t>
+        <w:t>Data Science and AI Innovation Research Promotion Center</w:t>
       </w:r>
     </w:p>
     <w:p>

</xml_diff>